<commit_message>
ISO W10 audit cakupan label USULAN (batch LEG, MKT, OPS, ISMS): 64 jalur, 19 diperbaiki ke cakupan bed1bb6
Diverifikasi worker terhadap bed1bb6 per jalur; build ulang 15 dokumen pass, halaman form tidak naik.

Co-Authored-By: Claude Opus 5.5 <noreply@anthropic.com>
Claude-Session: https://claude.ai/code/session_01BhkCQM7h3krZb9kjY2Nate
</commit_message>
<xml_diff>
--- a/out/04_Legal/SNX-LEG-FRM-01 Customer Contract Review Checklist (Rev00 DRAFT).docx
+++ b/out/04_Legal/SNX-LEG-FRM-01 Customer Contract Review Checklist (Rev00 DRAFT).docx
@@ -3669,7 +3669,7 @@
                 <w:sz w:val="24"/>
                 <w:szCs w:val="24"/>
               </w:rPr>
-              <w:t>Kontak utama Unit Kerja Pemohon untuk satu kontrak; di SNX-LEG-SOP-02 disebut PIC Bisnis (USULAN).</w:t>
+              <w:t>Kontak utama Unit Kerja Pemohon untuk satu kontrak. Di SNX-LEG-SOP-02 disebut PIC Bisnis (USULAN).</w:t>
             </w:r>
           </w:p>
         </w:tc>
@@ -4542,7 +4542,7 @@
           <w:sz w:val="24"/>
           <w:szCs w:val="24"/>
         </w:rPr>
-        <w:t xml:space="preserve">7. Kontrak yang berubah material setelah Persetujuan Legal ditelaah ulang sesuai SNX-LEG-SOP-02 butir 4.14. Staff Legal memakai form baru untuk telaah ulang itu (USULAN).</w:t>
+        <w:t xml:space="preserve">7. Kontrak yang berubah material setelah Persetujuan Legal ditelaah ulang sesuai SNX-LEG-SOP-02 butir 4.14, dan Staff Legal memakai form baru untuk telaah ulang itu (USULAN).</w:t>
       </w:r>
     </w:p>
     <w:p>

</xml_diff>